<commit_message>
Update official English and Chinese templates
</commit_message>
<xml_diff>
--- a/backend/templates/template_en.docx
+++ b/backend/templates/template_en.docx
@@ -3937,16 +3937,23 @@
           <w:rFonts w:ascii="Calibri" w:hAnsi="Calibri" w:cs="Calibri"/>
           <w:lang w:val="en-GB"/>
         </w:rPr>
-        <w:t xml:space="preserve"> (see </w:t>
+        <w:t xml:space="preserve"> (see</w:t>
+      </w:r>
+      <w:r>
+        <w:rPr>
+          <w:rFonts w:ascii="Times New Roman" w:hAnsi="Times New Roman" w:cs="Times New Roman"/>
+          <w:sz w:val="28"/>
+          <w:szCs w:val="28"/>
+        </w:rPr>
+        <w:t xml:space="preserve"> </w:t>
       </w:r>
       <w:hyperlink r:id="rId8" w:history="1">
         <w:r>
           <w:rPr>
             <w:rStyle w:val="a3"/>
-            <w:rFonts w:ascii="Calibri" w:hAnsi="Calibri" w:cs="Calibri"/>
-            <w:lang w:val="en-GB"/>
+            <w:rFonts w:cstheme="minorHAnsi"/>
           </w:rPr>
-          <w:t>www.mpu.edu.mo/teaching_learning/en/assessment_strategy.php</w:t>
+          <w:t>https://www.mpu.edu.mo/en/teaching-and-learning-centre/quality-framework/student_assessment_and_examinations/assessment_strategy</w:t>
         </w:r>
       </w:hyperlink>
       <w:r>
@@ -4016,6 +4023,8 @@
           <w:lang w:val="en-GB"/>
         </w:rPr>
       </w:r>
+      <w:bookmarkStart w:id="0" w:name="_GoBack"/>
+      <w:bookmarkEnd w:id="0"/>
     </w:p>
     <w:p>
       <w:pPr>
@@ -4438,16 +4447,22 @@
           <w:rFonts w:ascii="Calibri" w:hAnsi="Calibri" w:cs="Calibri"/>
           <w:lang w:val="en-GB"/>
         </w:rPr>
-        <w:t xml:space="preserve">be found at </w:t>
+        <w:t>be found at</w:t>
+      </w:r>
+      <w:r>
+        <w:rPr>
+          <w:rFonts w:ascii="Calibri" w:hAnsi="Calibri" w:cs="Calibri"/>
+          <w:lang w:val="en-GB"/>
+        </w:rPr>
+        <w:t xml:space="preserve"> </w:t>
       </w:r>
       <w:hyperlink r:id="rId9" w:history="1">
         <w:r>
           <w:rPr>
             <w:rStyle w:val="a3"/>
-            <w:rFonts w:ascii="Calibri" w:hAnsi="Calibri" w:cs="Calibri"/>
-            <w:lang w:val="en-GB"/>
+            <w:rFonts w:ascii="Times New Roman" w:hAnsi="Times New Roman" w:cs="Times New Roman"/>
           </w:rPr>
-          <w:t>www.mpu.edu.mo/student_handbook/</w:t>
+          <w:t>https://mpusite.mpu.edu.mo/studenthandbook/</w:t>
         </w:r>
       </w:hyperlink>
       <w:r>
@@ -4533,8 +4548,6 @@
       </w:rPr>
       <w:t>E-</w:t>
     </w:r>
-    <w:bookmarkStart w:id="0" w:name="_GoBack"/>
-    <w:bookmarkEnd w:id="0"/>
     <w:r>
       <w:rPr>
         <w:rFonts w:ascii="Calibri" w:hAnsi="Calibri" w:cs="Calibri"/>
@@ -5932,7 +5945,7 @@
 </file>
 
 <file path=customXml/itemProps1.xml><?xml version="1.0" encoding="utf-8"?>
-<ds:datastoreItem xmlns:ds="http://schemas.openxmlformats.org/officeDocument/2006/customXml" ds:itemID="{600D0A51-6F1A-48EC-A1FB-B044BF50FA5A}">
+<ds:datastoreItem xmlns:ds="http://schemas.openxmlformats.org/officeDocument/2006/customXml" ds:itemID="{D8797D47-28A3-4376-B025-FD14EFCF02E5}">
   <ds:schemaRefs>
     <ds:schemaRef ds:uri="http://schemas.openxmlformats.org/officeDocument/2006/bibliography"/>
   </ds:schemaRefs>

</xml_diff>